<commit_message>
implement add_code_in_text for HTML, odt and docx
</commit_message>
<xml_diff>
--- a/example/result/e30_code_blocks.docx
+++ b/example/result/e30_code_blocks.docx
@@ -38,7 +38,25 @@
         <w:t>Code blocks are written using the</w:t>
       </w:r>
       <w:r>
-        <w:t xml:space="preserve"> write_code_block() method.</w:t>
+        <w:rPr>
+          <w:rFonts w:ascii="Courier New" w:hAnsi="Courier New"/>
+        </w:rPr>
+        <w:t xml:space="preserve"> write_code_block()</w:t>
+      </w:r>
+      <w:r>
+        <w:t xml:space="preserve"> method. The function names mentioned in this paragraph</w:t>
+      </w:r>
+      <w:r>
+        <w:t xml:space="preserve"> are written using the</w:t>
+      </w:r>
+      <w:r>
+        <w:rPr>
+          <w:rFonts w:ascii="Courier New" w:hAnsi="Courier New"/>
+        </w:rPr>
+        <w:t xml:space="preserve"> add_code_in_text()</w:t>
+      </w:r>
+      <w:r>
+        <w:t xml:space="preserve"> method.</w:t>
       </w:r>
     </w:p>
     <w:p>
@@ -58,9 +76,13 @@
         <w:br/>
         <w:t xml:space="preserve">        print("i is positive")</w:t>
         <w:br/>
+        <w:t xml:space="preserve">    elif i &lt; 0:</w:t>
+        <w:br/>
+        <w:t xml:space="preserve">        print("i is negative")</w:t>
+        <w:br/>
         <w:t xml:space="preserve">    else:</w:t>
         <w:br/>
-        <w:t xml:space="preserve">        print("i is negative")</w:t>
+        <w:t xml:space="preserve">        print("i is zero")</w:t>
         <w:br/>
         <w:t xml:space="preserve">    print("This is another line of code.")</w:t>
         <w:br/>

</xml_diff>